<commit_message>
:ok_hand:style: ajustes de revisão na central de listagens
</commit_message>
<xml_diff>
--- a/Documentation/WORD/Sprint18_Task216_Aba_visualização detalhada_dados_backend.docx
+++ b/Documentation/WORD/Sprint18_Task216_Aba_visualização detalhada_dados_backend.docx
@@ -1,6 +1,6 @@
 
 <file path=word/document.xml><?xml version="1.0" encoding="utf-8"?>
-<w:document xmlns:wpc="http://schemas.microsoft.com/office/word/2010/wordprocessingCanvas" xmlns:cx="http://schemas.microsoft.com/office/drawing/2014/chartex" xmlns:cx1="http://schemas.microsoft.com/office/drawing/2015/9/8/chartex" xmlns:cx2="http://schemas.microsoft.com/office/drawing/2015/10/21/chartex" xmlns:cx3="http://schemas.microsoft.com/office/drawing/2016/5/9/chartex" xmlns:cx4="http://schemas.microsoft.com/office/drawing/2016/5/10/chartex" xmlns:cx5="http://schemas.microsoft.com/office/drawing/2016/5/11/chartex" xmlns:cx6="http://schemas.microsoft.com/office/drawing/2016/5/12/chartex" xmlns:cx7="http://schemas.microsoft.com/office/drawing/2016/5/13/chartex" xmlns:cx8="http://schemas.microsoft.com/office/drawing/2016/5/14/chartex" xmlns:mc="http://schemas.openxmlformats.org/markup-compatibility/2006" xmlns:aink="http://schemas.microsoft.com/office/drawing/2016/ink" xmlns:am3d="http://schemas.microsoft.com/office/drawing/2017/model3d" xmlns:o="urn:schemas-microsoft-com:office:office" xmlns:oel="http://schemas.microsoft.com/office/2019/extlst" xmlns:r="http://schemas.openxmlformats.org/officeDocument/2006/relationships" xmlns:m="http://schemas.openxmlformats.org/officeDocument/2006/math" xmlns:v="urn:schemas-microsoft-com:vml" xmlns:wp14="http://schemas.microsoft.com/office/word/2010/wordprocessingDrawing" xmlns:wp="http://schemas.openxmlformats.org/drawingml/2006/wordprocessingDrawing" xmlns:w10="urn:schemas-microsoft-com:office:word" xmlns:w="http://schemas.openxmlformats.org/wordprocessingml/2006/main" xmlns:w14="http://schemas.microsoft.com/office/word/2010/wordml" xmlns:w15="http://schemas.microsoft.com/office/word/2012/wordml" xmlns:w16cex="http://schemas.microsoft.com/office/word/2018/wordml/cex" xmlns:w16cid="http://schemas.microsoft.com/office/word/2016/wordml/cid" xmlns:w16="http://schemas.microsoft.com/office/word/2018/wordml" xmlns:w16sdtdh="http://schemas.microsoft.com/office/word/2020/wordml/sdtdatahash" xmlns:w16se="http://schemas.microsoft.com/office/word/2015/wordml/symex" xmlns:wpg="http://schemas.microsoft.com/office/word/2010/wordprocessingGroup" xmlns:wpi="http://schemas.microsoft.com/office/word/2010/wordprocessingInk" xmlns:wne="http://schemas.microsoft.com/office/word/2006/wordml" xmlns:wps="http://schemas.microsoft.com/office/word/2010/wordprocessingShape" mc:Ignorable="w14 w15 w16se w16cid w16 w16cex w16sdtdh wp14">
+<w:document xmlns:wpc="http://schemas.microsoft.com/office/word/2010/wordprocessingCanvas" xmlns:cx="http://schemas.microsoft.com/office/drawing/2014/chartex" xmlns:cx1="http://schemas.microsoft.com/office/drawing/2015/9/8/chartex" xmlns:cx2="http://schemas.microsoft.com/office/drawing/2015/10/21/chartex" xmlns:cx3="http://schemas.microsoft.com/office/drawing/2016/5/9/chartex" xmlns:cx4="http://schemas.microsoft.com/office/drawing/2016/5/10/chartex" xmlns:cx5="http://schemas.microsoft.com/office/drawing/2016/5/11/chartex" xmlns:cx6="http://schemas.microsoft.com/office/drawing/2016/5/12/chartex" xmlns:cx7="http://schemas.microsoft.com/office/drawing/2016/5/13/chartex" xmlns:cx8="http://schemas.microsoft.com/office/drawing/2016/5/14/chartex" xmlns:mc="http://schemas.openxmlformats.org/markup-compatibility/2006" xmlns:aink="http://schemas.microsoft.com/office/drawing/2016/ink" xmlns:am3d="http://schemas.microsoft.com/office/drawing/2017/model3d" xmlns:o="urn:schemas-microsoft-com:office:office" xmlns:oel="http://schemas.microsoft.com/office/2019/extlst" xmlns:r="http://schemas.openxmlformats.org/officeDocument/2006/relationships" xmlns:m="http://schemas.openxmlformats.org/officeDocument/2006/math" xmlns:v="urn:schemas-microsoft-com:vml" xmlns:wp14="http://schemas.microsoft.com/office/word/2010/wordprocessingDrawing" xmlns:wp="http://schemas.openxmlformats.org/drawingml/2006/wordprocessingDrawing" xmlns:w10="urn:schemas-microsoft-com:office:word" xmlns:w="http://schemas.openxmlformats.org/wordprocessingml/2006/main" xmlns:w14="http://schemas.microsoft.com/office/word/2010/wordml" xmlns:w15="http://schemas.microsoft.com/office/word/2012/wordml" xmlns:w16cex="http://schemas.microsoft.com/office/word/2018/wordml/cex" xmlns:w16cid="http://schemas.microsoft.com/office/word/2016/wordml/cid" xmlns:w16="http://schemas.microsoft.com/office/word/2018/wordml" xmlns:w16du="http://schemas.microsoft.com/office/word/2023/wordml/word16du" xmlns:w16sdtdh="http://schemas.microsoft.com/office/word/2020/wordml/sdtdatahash" xmlns:w16sdtfl="http://schemas.microsoft.com/office/word/2024/wordml/sdtformatlock" xmlns:w16se="http://schemas.microsoft.com/office/word/2015/wordml/symex" xmlns:wpg="http://schemas.microsoft.com/office/word/2010/wordprocessingGroup" xmlns:wpi="http://schemas.microsoft.com/office/word/2010/wordprocessingInk" xmlns:wne="http://schemas.microsoft.com/office/word/2006/wordml" xmlns:wps="http://schemas.microsoft.com/office/word/2010/wordprocessingShape" mc:Ignorable="w14 w15 w16se w16cid w16 w16cex w16sdtdh w16sdtfl w16du wp14">
   <w:body>
     <w:p>
       <w:pPr>
@@ -70,12 +70,6 @@
         <w:gridCol w:w="26"/>
       </w:tblGrid>
       <w:tr>
-        <w:tblPrEx>
-          <w:tblCellMar>
-            <w:top w:w="0" w:type="dxa"/>
-            <w:bottom w:w="0" w:type="dxa"/>
-          </w:tblCellMar>
-        </w:tblPrEx>
         <w:tc>
           <w:tcPr>
             <w:tcW w:w="10175" w:type="dxa"/>
@@ -128,7 +122,6 @@
         <w:tc>
           <w:tcPr>
             <w:tcW w:w="26" w:type="dxa"/>
-            <w:shd w:val="clear" w:color="auto" w:fill="auto"/>
             <w:tcMar>
               <w:top w:w="0" w:type="dxa"/>
               <w:left w:w="10" w:type="dxa"/>
@@ -145,12 +138,6 @@
         </w:tc>
       </w:tr>
       <w:tr>
-        <w:tblPrEx>
-          <w:tblCellMar>
-            <w:top w:w="0" w:type="dxa"/>
-            <w:bottom w:w="0" w:type="dxa"/>
-          </w:tblCellMar>
-        </w:tblPrEx>
         <w:tc>
           <w:tcPr>
             <w:tcW w:w="2829" w:type="dxa"/>
@@ -160,7 +147,6 @@
               <w:bottom w:val="single" w:sz="4" w:space="0" w:color="000000"/>
               <w:right w:val="single" w:sz="4" w:space="0" w:color="000000"/>
             </w:tcBorders>
-            <w:shd w:val="clear" w:color="auto" w:fill="auto"/>
             <w:tcMar>
               <w:top w:w="0" w:type="dxa"/>
               <w:left w:w="108" w:type="dxa"/>
@@ -194,7 +180,6 @@
               <w:bottom w:val="single" w:sz="4" w:space="0" w:color="000000"/>
               <w:right w:val="single" w:sz="4" w:space="0" w:color="000000"/>
             </w:tcBorders>
-            <w:shd w:val="clear" w:color="auto" w:fill="auto"/>
             <w:tcMar>
               <w:top w:w="0" w:type="dxa"/>
               <w:left w:w="108" w:type="dxa"/>
@@ -229,7 +214,6 @@
               <w:bottom w:val="single" w:sz="4" w:space="0" w:color="000000"/>
               <w:right w:val="single" w:sz="4" w:space="0" w:color="000000"/>
             </w:tcBorders>
-            <w:shd w:val="clear" w:color="auto" w:fill="auto"/>
             <w:tcMar>
               <w:top w:w="0" w:type="dxa"/>
               <w:left w:w="108" w:type="dxa"/>
@@ -256,12 +240,6 @@
         </w:tc>
       </w:tr>
       <w:tr>
-        <w:tblPrEx>
-          <w:tblCellMar>
-            <w:top w:w="0" w:type="dxa"/>
-            <w:bottom w:w="0" w:type="dxa"/>
-          </w:tblCellMar>
-        </w:tblPrEx>
         <w:tc>
           <w:tcPr>
             <w:tcW w:w="2829" w:type="dxa"/>
@@ -271,7 +249,70 @@
               <w:bottom w:val="single" w:sz="4" w:space="0" w:color="000000"/>
               <w:right w:val="single" w:sz="4" w:space="0" w:color="000000"/>
             </w:tcBorders>
-            <w:shd w:val="clear" w:color="auto" w:fill="auto"/>
+            <w:tcMar>
+              <w:top w:w="0" w:type="dxa"/>
+              <w:left w:w="108" w:type="dxa"/>
+              <w:bottom w:w="0" w:type="dxa"/>
+              <w:right w:w="108" w:type="dxa"/>
+            </w:tcMar>
+          </w:tcPr>
+          <w:p>
+            <w:pPr>
+              <w:spacing w:after="0" w:line="240" w:lineRule="auto"/>
+              <w:rPr>
+                <w:b/>
+                <w:bCs/>
+              </w:rPr>
+            </w:pPr>
+            <w:r>
+              <w:rPr>
+                <w:b/>
+                <w:bCs/>
+              </w:rPr>
+              <w:t>Proje</w:t>
+            </w:r>
+            <w:r>
+              <w:rPr>
+                <w:b/>
+                <w:bCs/>
+              </w:rPr>
+              <w:t>ct</w:t>
+            </w:r>
+            <w:r>
+              <w:rPr>
+                <w:b/>
+                <w:bCs/>
+              </w:rPr>
+              <w:t xml:space="preserve"> </w:t>
+            </w:r>
+            <w:proofErr w:type="spellStart"/>
+            <w:r>
+              <w:rPr>
+                <w:b/>
+                <w:bCs/>
+              </w:rPr>
+              <w:t>Name</w:t>
+            </w:r>
+            <w:proofErr w:type="spellEnd"/>
+            <w:r>
+              <w:rPr>
+                <w:b/>
+                <w:bCs/>
+              </w:rPr>
+              <w:t>:</w:t>
+            </w:r>
+          </w:p>
+        </w:tc>
+        <w:tc>
+          <w:tcPr>
+            <w:tcW w:w="7372" w:type="dxa"/>
+            <w:gridSpan w:val="3"/>
+            <w:tcBorders>
+              <w:top w:val="single" w:sz="4" w:space="0" w:color="000000"/>
+              <w:left w:val="single" w:sz="4" w:space="0" w:color="000000"/>
+              <w:bottom w:val="single" w:sz="4" w:space="0" w:color="000000"/>
+              <w:right w:val="single" w:sz="4" w:space="0" w:color="000000"/>
+            </w:tcBorders>
             <w:tcMar>
               <w:top w:w="0" w:type="dxa"/>
               <w:left w:w="108" w:type="dxa"/>
@@ -293,45 +334,22 @@
                 <w:b/>
                 <w:bCs/>
               </w:rPr>
-              <w:t>Projetc</w:t>
+              <w:t>Civitas-frontend</w:t>
             </w:r>
             <w:proofErr w:type="spellEnd"/>
-            <w:r>
-              <w:rPr>
-                <w:b/>
-                <w:bCs/>
-              </w:rPr>
-              <w:t xml:space="preserve"> </w:t>
-            </w:r>
-            <w:proofErr w:type="spellStart"/>
-            <w:r>
-              <w:rPr>
-                <w:b/>
-                <w:bCs/>
-              </w:rPr>
-              <w:t>Name</w:t>
-            </w:r>
-            <w:proofErr w:type="spellEnd"/>
-            <w:r>
-              <w:rPr>
-                <w:b/>
-                <w:bCs/>
-              </w:rPr>
-              <w:t>:</w:t>
-            </w:r>
           </w:p>
         </w:tc>
+      </w:tr>
+      <w:tr>
         <w:tc>
           <w:tcPr>
-            <w:tcW w:w="7372" w:type="dxa"/>
-            <w:gridSpan w:val="3"/>
+            <w:tcW w:w="2829" w:type="dxa"/>
             <w:tcBorders>
               <w:top w:val="single" w:sz="4" w:space="0" w:color="000000"/>
               <w:left w:val="single" w:sz="4" w:space="0" w:color="000000"/>
               <w:bottom w:val="single" w:sz="4" w:space="0" w:color="000000"/>
               <w:right w:val="single" w:sz="4" w:space="0" w:color="000000"/>
             </w:tcBorders>
-            <w:shd w:val="clear" w:color="auto" w:fill="auto"/>
             <w:tcMar>
               <w:top w:w="0" w:type="dxa"/>
               <w:left w:w="108" w:type="dxa"/>
@@ -347,35 +365,25 @@
                 <w:bCs/>
               </w:rPr>
             </w:pPr>
-            <w:proofErr w:type="spellStart"/>
             <w:r>
               <w:rPr>
                 <w:b/>
                 <w:bCs/>
               </w:rPr>
-              <w:t>Civitas-frontend</w:t>
-            </w:r>
-            <w:proofErr w:type="spellEnd"/>
+              <w:t>Ano: 5º</w:t>
+            </w:r>
           </w:p>
         </w:tc>
-      </w:tr>
-      <w:tr>
-        <w:tblPrEx>
-          <w:tblCellMar>
-            <w:top w:w="0" w:type="dxa"/>
-            <w:bottom w:w="0" w:type="dxa"/>
-          </w:tblCellMar>
-        </w:tblPrEx>
         <w:tc>
           <w:tcPr>
-            <w:tcW w:w="2829" w:type="dxa"/>
+            <w:tcW w:w="7372" w:type="dxa"/>
+            <w:gridSpan w:val="3"/>
             <w:tcBorders>
               <w:top w:val="single" w:sz="4" w:space="0" w:color="000000"/>
               <w:left w:val="single" w:sz="4" w:space="0" w:color="000000"/>
               <w:bottom w:val="single" w:sz="4" w:space="0" w:color="000000"/>
               <w:right w:val="single" w:sz="4" w:space="0" w:color="000000"/>
             </w:tcBorders>
-            <w:shd w:val="clear" w:color="auto" w:fill="auto"/>
             <w:tcMar>
               <w:top w:w="0" w:type="dxa"/>
               <w:left w:w="108" w:type="dxa"/>
@@ -396,53 +404,12 @@
                 <w:b/>
                 <w:bCs/>
               </w:rPr>
-              <w:t>Ano: 5º</w:t>
-            </w:r>
-          </w:p>
-        </w:tc>
-        <w:tc>
-          <w:tcPr>
-            <w:tcW w:w="7372" w:type="dxa"/>
-            <w:gridSpan w:val="3"/>
-            <w:tcBorders>
-              <w:top w:val="single" w:sz="4" w:space="0" w:color="000000"/>
-              <w:left w:val="single" w:sz="4" w:space="0" w:color="000000"/>
-              <w:bottom w:val="single" w:sz="4" w:space="0" w:color="000000"/>
-              <w:right w:val="single" w:sz="4" w:space="0" w:color="000000"/>
-            </w:tcBorders>
-            <w:shd w:val="clear" w:color="auto" w:fill="auto"/>
-            <w:tcMar>
-              <w:top w:w="0" w:type="dxa"/>
-              <w:left w:w="108" w:type="dxa"/>
-              <w:bottom w:w="0" w:type="dxa"/>
-              <w:right w:w="108" w:type="dxa"/>
-            </w:tcMar>
-          </w:tcPr>
-          <w:p>
-            <w:pPr>
-              <w:spacing w:after="0" w:line="240" w:lineRule="auto"/>
-              <w:rPr>
-                <w:b/>
-                <w:bCs/>
-              </w:rPr>
-            </w:pPr>
-            <w:r>
-              <w:rPr>
-                <w:b/>
-                <w:bCs/>
-              </w:rPr>
               <w:t>Análise e Desenvolvimento de Sistemas - AMS</w:t>
             </w:r>
           </w:p>
         </w:tc>
       </w:tr>
       <w:tr>
-        <w:tblPrEx>
-          <w:tblCellMar>
-            <w:top w:w="0" w:type="dxa"/>
-            <w:bottom w:w="0" w:type="dxa"/>
-          </w:tblCellMar>
-        </w:tblPrEx>
         <w:tc>
           <w:tcPr>
             <w:tcW w:w="10201" w:type="dxa"/>
@@ -490,12 +457,6 @@
         </w:tc>
       </w:tr>
       <w:tr>
-        <w:tblPrEx>
-          <w:tblCellMar>
-            <w:top w:w="0" w:type="dxa"/>
-            <w:bottom w:w="0" w:type="dxa"/>
-          </w:tblCellMar>
-        </w:tblPrEx>
         <w:trPr>
           <w:trHeight w:val="300"/>
         </w:trPr>
@@ -509,7 +470,6 @@
               <w:bottom w:val="single" w:sz="4" w:space="0" w:color="000000"/>
               <w:right w:val="single" w:sz="4" w:space="0" w:color="000000"/>
             </w:tcBorders>
-            <w:shd w:val="clear" w:color="auto" w:fill="auto"/>
             <w:tcMar>
               <w:top w:w="0" w:type="dxa"/>
               <w:left w:w="108" w:type="dxa"/>
@@ -528,12 +488,6 @@
         </w:tc>
       </w:tr>
       <w:tr>
-        <w:tblPrEx>
-          <w:tblCellMar>
-            <w:top w:w="0" w:type="dxa"/>
-            <w:bottom w:w="0" w:type="dxa"/>
-          </w:tblCellMar>
-        </w:tblPrEx>
         <w:tc>
           <w:tcPr>
             <w:tcW w:w="10201" w:type="dxa"/>
@@ -544,7 +498,6 @@
               <w:bottom w:val="single" w:sz="4" w:space="0" w:color="000000"/>
               <w:right w:val="single" w:sz="4" w:space="0" w:color="000000"/>
             </w:tcBorders>
-            <w:shd w:val="clear" w:color="auto" w:fill="auto"/>
             <w:tcMar>
               <w:top w:w="0" w:type="dxa"/>
               <w:left w:w="108" w:type="dxa"/>
@@ -563,12 +516,6 @@
         </w:tc>
       </w:tr>
       <w:tr>
-        <w:tblPrEx>
-          <w:tblCellMar>
-            <w:top w:w="0" w:type="dxa"/>
-            <w:bottom w:w="0" w:type="dxa"/>
-          </w:tblCellMar>
-        </w:tblPrEx>
         <w:tc>
           <w:tcPr>
             <w:tcW w:w="10201" w:type="dxa"/>
@@ -579,7 +526,6 @@
               <w:bottom w:val="single" w:sz="4" w:space="0" w:color="000000"/>
               <w:right w:val="single" w:sz="4" w:space="0" w:color="000000"/>
             </w:tcBorders>
-            <w:shd w:val="clear" w:color="auto" w:fill="auto"/>
             <w:tcMar>
               <w:top w:w="0" w:type="dxa"/>
               <w:left w:w="108" w:type="dxa"/>
@@ -615,12 +561,6 @@
         <w:gridCol w:w="1672"/>
       </w:tblGrid>
       <w:tr>
-        <w:tblPrEx>
-          <w:tblCellMar>
-            <w:top w:w="0" w:type="dxa"/>
-            <w:bottom w:w="0" w:type="dxa"/>
-          </w:tblCellMar>
-        </w:tblPrEx>
         <w:tc>
           <w:tcPr>
             <w:tcW w:w="10201" w:type="dxa"/>
@@ -659,12 +599,6 @@
         </w:tc>
       </w:tr>
       <w:tr>
-        <w:tblPrEx>
-          <w:tblCellMar>
-            <w:top w:w="0" w:type="dxa"/>
-            <w:bottom w:w="0" w:type="dxa"/>
-          </w:tblCellMar>
-        </w:tblPrEx>
         <w:tc>
           <w:tcPr>
             <w:tcW w:w="754" w:type="dxa"/>
@@ -674,7 +608,6 @@
               <w:bottom w:val="single" w:sz="4" w:space="0" w:color="000000"/>
               <w:right w:val="single" w:sz="4" w:space="0" w:color="000000"/>
             </w:tcBorders>
-            <w:shd w:val="clear" w:color="auto" w:fill="auto"/>
             <w:tcMar>
               <w:top w:w="0" w:type="dxa"/>
               <w:left w:w="108" w:type="dxa"/>
@@ -700,7 +633,6 @@
               <w:bottom w:val="single" w:sz="4" w:space="0" w:color="000000"/>
               <w:right w:val="single" w:sz="4" w:space="0" w:color="000000"/>
             </w:tcBorders>
-            <w:shd w:val="clear" w:color="auto" w:fill="auto"/>
             <w:tcMar>
               <w:top w:w="0" w:type="dxa"/>
               <w:left w:w="108" w:type="dxa"/>
@@ -728,7 +660,6 @@
               <w:bottom w:val="single" w:sz="4" w:space="0" w:color="000000"/>
               <w:right w:val="single" w:sz="4" w:space="0" w:color="000000"/>
             </w:tcBorders>
-            <w:shd w:val="clear" w:color="auto" w:fill="auto"/>
             <w:tcMar>
               <w:top w:w="0" w:type="dxa"/>
               <w:left w:w="108" w:type="dxa"/>
@@ -754,7 +685,6 @@
               <w:bottom w:val="single" w:sz="4" w:space="0" w:color="000000"/>
               <w:right w:val="single" w:sz="4" w:space="0" w:color="000000"/>
             </w:tcBorders>
-            <w:shd w:val="clear" w:color="auto" w:fill="auto"/>
             <w:tcMar>
               <w:top w:w="0" w:type="dxa"/>
               <w:left w:w="108" w:type="dxa"/>
@@ -773,12 +703,6 @@
         </w:tc>
       </w:tr>
       <w:tr>
-        <w:tblPrEx>
-          <w:tblCellMar>
-            <w:top w:w="0" w:type="dxa"/>
-            <w:bottom w:w="0" w:type="dxa"/>
-          </w:tblCellMar>
-        </w:tblPrEx>
         <w:tc>
           <w:tcPr>
             <w:tcW w:w="754" w:type="dxa"/>
@@ -788,7 +712,6 @@
               <w:bottom w:val="single" w:sz="4" w:space="0" w:color="000000"/>
               <w:right w:val="single" w:sz="4" w:space="0" w:color="000000"/>
             </w:tcBorders>
-            <w:shd w:val="clear" w:color="auto" w:fill="auto"/>
             <w:tcMar>
               <w:top w:w="0" w:type="dxa"/>
               <w:left w:w="108" w:type="dxa"/>
@@ -814,7 +737,6 @@
               <w:bottom w:val="single" w:sz="4" w:space="0" w:color="000000"/>
               <w:right w:val="single" w:sz="4" w:space="0" w:color="000000"/>
             </w:tcBorders>
-            <w:shd w:val="clear" w:color="auto" w:fill="auto"/>
             <w:tcMar>
               <w:top w:w="0" w:type="dxa"/>
               <w:left w:w="108" w:type="dxa"/>
@@ -843,13 +765,8 @@
             </w:r>
             <w:proofErr w:type="spellEnd"/>
             <w:r>
-              <w:t xml:space="preserve"> </w:t>
-            </w:r>
-            <w:proofErr w:type="gramStart"/>
-            <w:r>
-              <w:t>por filtros diverso</w:t>
-            </w:r>
-            <w:proofErr w:type="gramEnd"/>
+              <w:t xml:space="preserve"> por filtros diverso</w:t>
+            </w:r>
           </w:p>
           <w:p>
             <w:pPr>
@@ -866,7 +783,6 @@
               <w:bottom w:val="single" w:sz="4" w:space="0" w:color="000000"/>
               <w:right w:val="single" w:sz="4" w:space="0" w:color="000000"/>
             </w:tcBorders>
-            <w:shd w:val="clear" w:color="auto" w:fill="auto"/>
             <w:tcMar>
               <w:top w:w="0" w:type="dxa"/>
               <w:left w:w="108" w:type="dxa"/>
@@ -892,7 +808,6 @@
               <w:bottom w:val="single" w:sz="4" w:space="0" w:color="000000"/>
               <w:right w:val="single" w:sz="4" w:space="0" w:color="000000"/>
             </w:tcBorders>
-            <w:shd w:val="clear" w:color="auto" w:fill="auto"/>
             <w:tcMar>
               <w:top w:w="0" w:type="dxa"/>
               <w:left w:w="108" w:type="dxa"/>
@@ -930,12 +845,6 @@
         <w:gridCol w:w="1683"/>
       </w:tblGrid>
       <w:tr>
-        <w:tblPrEx>
-          <w:tblCellMar>
-            <w:top w:w="0" w:type="dxa"/>
-            <w:bottom w:w="0" w:type="dxa"/>
-          </w:tblCellMar>
-        </w:tblPrEx>
         <w:tc>
           <w:tcPr>
             <w:tcW w:w="10183" w:type="dxa"/>
@@ -983,12 +892,6 @@
         </w:tc>
       </w:tr>
       <w:tr>
-        <w:tblPrEx>
-          <w:tblCellMar>
-            <w:top w:w="0" w:type="dxa"/>
-            <w:bottom w:w="0" w:type="dxa"/>
-          </w:tblCellMar>
-        </w:tblPrEx>
         <w:tc>
           <w:tcPr>
             <w:tcW w:w="828" w:type="dxa"/>
@@ -998,7 +901,6 @@
               <w:bottom w:val="single" w:sz="4" w:space="0" w:color="000000"/>
               <w:right w:val="single" w:sz="4" w:space="0" w:color="000000"/>
             </w:tcBorders>
-            <w:shd w:val="clear" w:color="auto" w:fill="auto"/>
             <w:tcMar>
               <w:top w:w="0" w:type="dxa"/>
               <w:left w:w="108" w:type="dxa"/>
@@ -1024,7 +926,6 @@
               <w:bottom w:val="single" w:sz="4" w:space="0" w:color="000000"/>
               <w:right w:val="single" w:sz="4" w:space="0" w:color="000000"/>
             </w:tcBorders>
-            <w:shd w:val="clear" w:color="auto" w:fill="auto"/>
             <w:tcMar>
               <w:top w:w="0" w:type="dxa"/>
               <w:left w:w="108" w:type="dxa"/>
@@ -1052,7 +953,6 @@
               <w:bottom w:val="single" w:sz="4" w:space="0" w:color="000000"/>
               <w:right w:val="single" w:sz="4" w:space="0" w:color="000000"/>
             </w:tcBorders>
-            <w:shd w:val="clear" w:color="auto" w:fill="auto"/>
             <w:tcMar>
               <w:top w:w="0" w:type="dxa"/>
               <w:left w:w="108" w:type="dxa"/>
@@ -1088,7 +988,6 @@
               <w:bottom w:val="single" w:sz="4" w:space="0" w:color="000000"/>
               <w:right w:val="single" w:sz="4" w:space="0" w:color="000000"/>
             </w:tcBorders>
-            <w:shd w:val="clear" w:color="auto" w:fill="auto"/>
             <w:tcMar>
               <w:top w:w="0" w:type="dxa"/>
               <w:left w:w="108" w:type="dxa"/>
@@ -1114,7 +1013,6 @@
               <w:bottom w:val="single" w:sz="4" w:space="0" w:color="000000"/>
               <w:right w:val="single" w:sz="4" w:space="0" w:color="000000"/>
             </w:tcBorders>
-            <w:shd w:val="clear" w:color="auto" w:fill="auto"/>
             <w:tcMar>
               <w:top w:w="0" w:type="dxa"/>
               <w:left w:w="108" w:type="dxa"/>
@@ -1145,7 +1043,6 @@
               <w:bottom w:val="single" w:sz="4" w:space="0" w:color="000000"/>
               <w:right w:val="single" w:sz="4" w:space="0" w:color="000000"/>
             </w:tcBorders>
-            <w:shd w:val="clear" w:color="auto" w:fill="auto"/>
             <w:tcMar>
               <w:top w:w="0" w:type="dxa"/>
               <w:left w:w="108" w:type="dxa"/>
@@ -1169,12 +1066,6 @@
         </w:tc>
       </w:tr>
       <w:tr>
-        <w:tblPrEx>
-          <w:tblCellMar>
-            <w:top w:w="0" w:type="dxa"/>
-            <w:bottom w:w="0" w:type="dxa"/>
-          </w:tblCellMar>
-        </w:tblPrEx>
         <w:tc>
           <w:tcPr>
             <w:tcW w:w="828" w:type="dxa"/>
@@ -1184,7 +1075,6 @@
               <w:bottom w:val="single" w:sz="4" w:space="0" w:color="000000"/>
               <w:right w:val="single" w:sz="4" w:space="0" w:color="000000"/>
             </w:tcBorders>
-            <w:shd w:val="clear" w:color="auto" w:fill="auto"/>
             <w:tcMar>
               <w:top w:w="0" w:type="dxa"/>
               <w:left w:w="108" w:type="dxa"/>
@@ -1210,7 +1100,6 @@
               <w:bottom w:val="single" w:sz="4" w:space="0" w:color="000000"/>
               <w:right w:val="single" w:sz="4" w:space="0" w:color="000000"/>
             </w:tcBorders>
-            <w:shd w:val="clear" w:color="auto" w:fill="auto"/>
             <w:tcMar>
               <w:top w:w="0" w:type="dxa"/>
               <w:left w:w="108" w:type="dxa"/>
@@ -1259,17 +1148,8 @@
                 <w:rStyle w:val="Tipodeletrapredefinidodopargrafo"/>
                 <w:rFonts w:cs="Aptos"/>
               </w:rPr>
-              <w:t xml:space="preserve"> </w:t>
-            </w:r>
-            <w:proofErr w:type="gramStart"/>
-            <w:r>
-              <w:rPr>
-                <w:rStyle w:val="Tipodeletrapredefinidodopargrafo"/>
-                <w:rFonts w:cs="Aptos"/>
-              </w:rPr>
-              <w:t>por filtros diverso</w:t>
-            </w:r>
-            <w:proofErr w:type="gramEnd"/>
+              <w:t xml:space="preserve"> por filtros diverso</w:t>
+            </w:r>
           </w:p>
         </w:tc>
         <w:tc>
@@ -1281,7 +1161,6 @@
               <w:bottom w:val="single" w:sz="4" w:space="0" w:color="000000"/>
               <w:right w:val="single" w:sz="4" w:space="0" w:color="000000"/>
             </w:tcBorders>
-            <w:shd w:val="clear" w:color="auto" w:fill="auto"/>
             <w:tcMar>
               <w:top w:w="0" w:type="dxa"/>
               <w:left w:w="108" w:type="dxa"/>
@@ -1315,7 +1194,6 @@
               <w:bottom w:val="single" w:sz="4" w:space="0" w:color="000000"/>
               <w:right w:val="single" w:sz="4" w:space="0" w:color="000000"/>
             </w:tcBorders>
-            <w:shd w:val="clear" w:color="auto" w:fill="auto"/>
             <w:tcMar>
               <w:top w:w="0" w:type="dxa"/>
               <w:left w:w="108" w:type="dxa"/>
@@ -1341,7 +1219,6 @@
               <w:bottom w:val="single" w:sz="4" w:space="0" w:color="000000"/>
               <w:right w:val="single" w:sz="4" w:space="0" w:color="000000"/>
             </w:tcBorders>
-            <w:shd w:val="clear" w:color="auto" w:fill="auto"/>
             <w:tcMar>
               <w:top w:w="0" w:type="dxa"/>
               <w:left w:w="108" w:type="dxa"/>
@@ -1367,7 +1244,6 @@
               <w:bottom w:val="single" w:sz="4" w:space="0" w:color="000000"/>
               <w:right w:val="single" w:sz="4" w:space="0" w:color="000000"/>
             </w:tcBorders>
-            <w:shd w:val="clear" w:color="auto" w:fill="auto"/>
             <w:tcMar>
               <w:top w:w="0" w:type="dxa"/>
               <w:left w:w="108" w:type="dxa"/>
@@ -1724,7 +1600,15 @@
       </w:r>
       <w:proofErr w:type="spellEnd"/>
       <w:r>
-        <w:t>, etc).</w:t>
+        <w:t xml:space="preserve">, </w:t>
+      </w:r>
+      <w:proofErr w:type="spellStart"/>
+      <w:r>
+        <w:t>etc</w:t>
+      </w:r>
+      <w:proofErr w:type="spellEnd"/>
+      <w:r>
+        <w:t>).</w:t>
       </w:r>
     </w:p>
     <w:p>
@@ -1962,7 +1846,7 @@
 </file>
 
 <file path=word/endnotes.xml><?xml version="1.0" encoding="utf-8"?>
-<w:endnotes xmlns:wpc="http://schemas.microsoft.com/office/word/2010/wordprocessingCanvas" xmlns:cx="http://schemas.microsoft.com/office/drawing/2014/chartex" xmlns:cx1="http://schemas.microsoft.com/office/drawing/2015/9/8/chartex" xmlns:cx2="http://schemas.microsoft.com/office/drawing/2015/10/21/chartex" xmlns:cx3="http://schemas.microsoft.com/office/drawing/2016/5/9/chartex" xmlns:cx4="http://schemas.microsoft.com/office/drawing/2016/5/10/chartex" xmlns:cx5="http://schemas.microsoft.com/office/drawing/2016/5/11/chartex" xmlns:cx6="http://schemas.microsoft.com/office/drawing/2016/5/12/chartex" xmlns:cx7="http://schemas.microsoft.com/office/drawing/2016/5/13/chartex" xmlns:cx8="http://schemas.microsoft.com/office/drawing/2016/5/14/chartex" xmlns:mc="http://schemas.openxmlformats.org/markup-compatibility/2006" xmlns:aink="http://schemas.microsoft.com/office/drawing/2016/ink" xmlns:am3d="http://schemas.microsoft.com/office/drawing/2017/model3d" xmlns:o="urn:schemas-microsoft-com:office:office" xmlns:oel="http://schemas.microsoft.com/office/2019/extlst" xmlns:r="http://schemas.openxmlformats.org/officeDocument/2006/relationships" xmlns:m="http://schemas.openxmlformats.org/officeDocument/2006/math" xmlns:v="urn:schemas-microsoft-com:vml" xmlns:wp14="http://schemas.microsoft.com/office/word/2010/wordprocessingDrawing" xmlns:wp="http://schemas.openxmlformats.org/drawingml/2006/wordprocessingDrawing" xmlns:w10="urn:schemas-microsoft-com:office:word" xmlns:w="http://schemas.openxmlformats.org/wordprocessingml/2006/main" xmlns:w14="http://schemas.microsoft.com/office/word/2010/wordml" xmlns:w15="http://schemas.microsoft.com/office/word/2012/wordml" xmlns:w16cex="http://schemas.microsoft.com/office/word/2018/wordml/cex" xmlns:w16cid="http://schemas.microsoft.com/office/word/2016/wordml/cid" xmlns:w16="http://schemas.microsoft.com/office/word/2018/wordml" xmlns:w16sdtdh="http://schemas.microsoft.com/office/word/2020/wordml/sdtdatahash" xmlns:w16se="http://schemas.microsoft.com/office/word/2015/wordml/symex" xmlns:wpg="http://schemas.microsoft.com/office/word/2010/wordprocessingGroup" xmlns:wpi="http://schemas.microsoft.com/office/word/2010/wordprocessingInk" xmlns:wne="http://schemas.microsoft.com/office/word/2006/wordml" xmlns:wps="http://schemas.microsoft.com/office/word/2010/wordprocessingShape" mc:Ignorable="w14 w15 w16se w16cid w16 w16cex w16sdtdh wp14">
+<w:endnotes xmlns:wpc="http://schemas.microsoft.com/office/word/2010/wordprocessingCanvas" xmlns:cx="http://schemas.microsoft.com/office/drawing/2014/chartex" xmlns:cx1="http://schemas.microsoft.com/office/drawing/2015/9/8/chartex" xmlns:cx2="http://schemas.microsoft.com/office/drawing/2015/10/21/chartex" xmlns:cx3="http://schemas.microsoft.com/office/drawing/2016/5/9/chartex" xmlns:cx4="http://schemas.microsoft.com/office/drawing/2016/5/10/chartex" xmlns:cx5="http://schemas.microsoft.com/office/drawing/2016/5/11/chartex" xmlns:cx6="http://schemas.microsoft.com/office/drawing/2016/5/12/chartex" xmlns:cx7="http://schemas.microsoft.com/office/drawing/2016/5/13/chartex" xmlns:cx8="http://schemas.microsoft.com/office/drawing/2016/5/14/chartex" xmlns:mc="http://schemas.openxmlformats.org/markup-compatibility/2006" xmlns:aink="http://schemas.microsoft.com/office/drawing/2016/ink" xmlns:am3d="http://schemas.microsoft.com/office/drawing/2017/model3d" xmlns:o="urn:schemas-microsoft-com:office:office" xmlns:oel="http://schemas.microsoft.com/office/2019/extlst" xmlns:r="http://schemas.openxmlformats.org/officeDocument/2006/relationships" xmlns:m="http://schemas.openxmlformats.org/officeDocument/2006/math" xmlns:v="urn:schemas-microsoft-com:vml" xmlns:wp14="http://schemas.microsoft.com/office/word/2010/wordprocessingDrawing" xmlns:wp="http://schemas.openxmlformats.org/drawingml/2006/wordprocessingDrawing" xmlns:w10="urn:schemas-microsoft-com:office:word" xmlns:w="http://schemas.openxmlformats.org/wordprocessingml/2006/main" xmlns:w14="http://schemas.microsoft.com/office/word/2010/wordml" xmlns:w15="http://schemas.microsoft.com/office/word/2012/wordml" xmlns:w16cex="http://schemas.microsoft.com/office/word/2018/wordml/cex" xmlns:w16cid="http://schemas.microsoft.com/office/word/2016/wordml/cid" xmlns:w16="http://schemas.microsoft.com/office/word/2018/wordml" xmlns:w16du="http://schemas.microsoft.com/office/word/2023/wordml/word16du" xmlns:w16sdtdh="http://schemas.microsoft.com/office/word/2020/wordml/sdtdatahash" xmlns:w16sdtfl="http://schemas.microsoft.com/office/word/2024/wordml/sdtformatlock" xmlns:w16se="http://schemas.microsoft.com/office/word/2015/wordml/symex" xmlns:wpg="http://schemas.microsoft.com/office/word/2010/wordprocessingGroup" xmlns:wpi="http://schemas.microsoft.com/office/word/2010/wordprocessingInk" xmlns:wne="http://schemas.microsoft.com/office/word/2006/wordml" xmlns:wps="http://schemas.microsoft.com/office/word/2010/wordprocessingShape" mc:Ignorable="w14 w15 w16se w16cid w16 w16cex w16sdtdh w16sdtfl w16du wp14">
   <w:endnote w:type="separator" w:id="-1">
     <w:p>
       <w:pPr>
@@ -1987,7 +1871,7 @@
 </file>
 
 <file path=word/footnotes.xml><?xml version="1.0" encoding="utf-8"?>
-<w:footnotes xmlns:wpc="http://schemas.microsoft.com/office/word/2010/wordprocessingCanvas" xmlns:cx="http://schemas.microsoft.com/office/drawing/2014/chartex" xmlns:cx1="http://schemas.microsoft.com/office/drawing/2015/9/8/chartex" xmlns:cx2="http://schemas.microsoft.com/office/drawing/2015/10/21/chartex" xmlns:cx3="http://schemas.microsoft.com/office/drawing/2016/5/9/chartex" xmlns:cx4="http://schemas.microsoft.com/office/drawing/2016/5/10/chartex" xmlns:cx5="http://schemas.microsoft.com/office/drawing/2016/5/11/chartex" xmlns:cx6="http://schemas.microsoft.com/office/drawing/2016/5/12/chartex" xmlns:cx7="http://schemas.microsoft.com/office/drawing/2016/5/13/chartex" xmlns:cx8="http://schemas.microsoft.com/office/drawing/2016/5/14/chartex" xmlns:mc="http://schemas.openxmlformats.org/markup-compatibility/2006" xmlns:aink="http://schemas.microsoft.com/office/drawing/2016/ink" xmlns:am3d="http://schemas.microsoft.com/office/drawing/2017/model3d" xmlns:o="urn:schemas-microsoft-com:office:office" xmlns:oel="http://schemas.microsoft.com/office/2019/extlst" xmlns:r="http://schemas.openxmlformats.org/officeDocument/2006/relationships" xmlns:m="http://schemas.openxmlformats.org/officeDocument/2006/math" xmlns:v="urn:schemas-microsoft-com:vml" xmlns:wp14="http://schemas.microsoft.com/office/word/2010/wordprocessingDrawing" xmlns:wp="http://schemas.openxmlformats.org/drawingml/2006/wordprocessingDrawing" xmlns:w10="urn:schemas-microsoft-com:office:word" xmlns:w="http://schemas.openxmlformats.org/wordprocessingml/2006/main" xmlns:w14="http://schemas.microsoft.com/office/word/2010/wordml" xmlns:w15="http://schemas.microsoft.com/office/word/2012/wordml" xmlns:w16cex="http://schemas.microsoft.com/office/word/2018/wordml/cex" xmlns:w16cid="http://schemas.microsoft.com/office/word/2016/wordml/cid" xmlns:w16="http://schemas.microsoft.com/office/word/2018/wordml" xmlns:w16sdtdh="http://schemas.microsoft.com/office/word/2020/wordml/sdtdatahash" xmlns:w16se="http://schemas.microsoft.com/office/word/2015/wordml/symex" xmlns:wpg="http://schemas.microsoft.com/office/word/2010/wordprocessingGroup" xmlns:wpi="http://schemas.microsoft.com/office/word/2010/wordprocessingInk" xmlns:wne="http://schemas.microsoft.com/office/word/2006/wordml" xmlns:wps="http://schemas.microsoft.com/office/word/2010/wordprocessingShape" mc:Ignorable="w14 w15 w16se w16cid w16 w16cex w16sdtdh wp14">
+<w:footnotes xmlns:wpc="http://schemas.microsoft.com/office/word/2010/wordprocessingCanvas" xmlns:cx="http://schemas.microsoft.com/office/drawing/2014/chartex" xmlns:cx1="http://schemas.microsoft.com/office/drawing/2015/9/8/chartex" xmlns:cx2="http://schemas.microsoft.com/office/drawing/2015/10/21/chartex" xmlns:cx3="http://schemas.microsoft.com/office/drawing/2016/5/9/chartex" xmlns:cx4="http://schemas.microsoft.com/office/drawing/2016/5/10/chartex" xmlns:cx5="http://schemas.microsoft.com/office/drawing/2016/5/11/chartex" xmlns:cx6="http://schemas.microsoft.com/office/drawing/2016/5/12/chartex" xmlns:cx7="http://schemas.microsoft.com/office/drawing/2016/5/13/chartex" xmlns:cx8="http://schemas.microsoft.com/office/drawing/2016/5/14/chartex" xmlns:mc="http://schemas.openxmlformats.org/markup-compatibility/2006" xmlns:aink="http://schemas.microsoft.com/office/drawing/2016/ink" xmlns:am3d="http://schemas.microsoft.com/office/drawing/2017/model3d" xmlns:o="urn:schemas-microsoft-com:office:office" xmlns:oel="http://schemas.microsoft.com/office/2019/extlst" xmlns:r="http://schemas.openxmlformats.org/officeDocument/2006/relationships" xmlns:m="http://schemas.openxmlformats.org/officeDocument/2006/math" xmlns:v="urn:schemas-microsoft-com:vml" xmlns:wp14="http://schemas.microsoft.com/office/word/2010/wordprocessingDrawing" xmlns:wp="http://schemas.openxmlformats.org/drawingml/2006/wordprocessingDrawing" xmlns:w10="urn:schemas-microsoft-com:office:word" xmlns:w="http://schemas.openxmlformats.org/wordprocessingml/2006/main" xmlns:w14="http://schemas.microsoft.com/office/word/2010/wordml" xmlns:w15="http://schemas.microsoft.com/office/word/2012/wordml" xmlns:w16cex="http://schemas.microsoft.com/office/word/2018/wordml/cex" xmlns:w16cid="http://schemas.microsoft.com/office/word/2016/wordml/cid" xmlns:w16="http://schemas.microsoft.com/office/word/2018/wordml" xmlns:w16du="http://schemas.microsoft.com/office/word/2023/wordml/word16du" xmlns:w16sdtdh="http://schemas.microsoft.com/office/word/2020/wordml/sdtdatahash" xmlns:w16sdtfl="http://schemas.microsoft.com/office/word/2024/wordml/sdtformatlock" xmlns:w16se="http://schemas.microsoft.com/office/word/2015/wordml/symex" xmlns:wpg="http://schemas.microsoft.com/office/word/2010/wordprocessingGroup" xmlns:wpi="http://schemas.microsoft.com/office/word/2010/wordprocessingInk" xmlns:wne="http://schemas.microsoft.com/office/word/2006/wordml" xmlns:wps="http://schemas.microsoft.com/office/word/2010/wordprocessingShape" mc:Ignorable="w14 w15 w16se w16cid w16 w16cex w16sdtdh w16sdtfl w16du wp14">
   <w:footnote w:type="separator" w:id="-1">
     <w:p>
       <w:pPr>
@@ -2012,7 +1896,7 @@
 </file>
 
 <file path=word/numbering.xml><?xml version="1.0" encoding="utf-8"?>
-<w:numbering xmlns:wpc="http://schemas.microsoft.com/office/word/2010/wordprocessingCanvas" xmlns:cx="http://schemas.microsoft.com/office/drawing/2014/chartex" xmlns:cx1="http://schemas.microsoft.com/office/drawing/2015/9/8/chartex" xmlns:cx2="http://schemas.microsoft.com/office/drawing/2015/10/21/chartex" xmlns:cx3="http://schemas.microsoft.com/office/drawing/2016/5/9/chartex" xmlns:cx4="http://schemas.microsoft.com/office/drawing/2016/5/10/chartex" xmlns:cx5="http://schemas.microsoft.com/office/drawing/2016/5/11/chartex" xmlns:cx6="http://schemas.microsoft.com/office/drawing/2016/5/12/chartex" xmlns:cx7="http://schemas.microsoft.com/office/drawing/2016/5/13/chartex" xmlns:cx8="http://schemas.microsoft.com/office/drawing/2016/5/14/chartex" xmlns:mc="http://schemas.openxmlformats.org/markup-compatibility/2006" xmlns:aink="http://schemas.microsoft.com/office/drawing/2016/ink" xmlns:am3d="http://schemas.microsoft.com/office/drawing/2017/model3d" xmlns:o="urn:schemas-microsoft-com:office:office" xmlns:oel="http://schemas.microsoft.com/office/2019/extlst" xmlns:r="http://schemas.openxmlformats.org/officeDocument/2006/relationships" xmlns:m="http://schemas.openxmlformats.org/officeDocument/2006/math" xmlns:v="urn:schemas-microsoft-com:vml" xmlns:wp14="http://schemas.microsoft.com/office/word/2010/wordprocessingDrawing" xmlns:wp="http://schemas.openxmlformats.org/drawingml/2006/wordprocessingDrawing" xmlns:w10="urn:schemas-microsoft-com:office:word" xmlns:w="http://schemas.openxmlformats.org/wordprocessingml/2006/main" xmlns:w14="http://schemas.microsoft.com/office/word/2010/wordml" xmlns:w15="http://schemas.microsoft.com/office/word/2012/wordml" xmlns:w16cex="http://schemas.microsoft.com/office/word/2018/wordml/cex" xmlns:w16cid="http://schemas.microsoft.com/office/word/2016/wordml/cid" xmlns:w16="http://schemas.microsoft.com/office/word/2018/wordml" xmlns:w16sdtdh="http://schemas.microsoft.com/office/word/2020/wordml/sdtdatahash" xmlns:w16se="http://schemas.microsoft.com/office/word/2015/wordml/symex" xmlns:wpg="http://schemas.microsoft.com/office/word/2010/wordprocessingGroup" xmlns:wpi="http://schemas.microsoft.com/office/word/2010/wordprocessingInk" xmlns:wne="http://schemas.microsoft.com/office/word/2006/wordml" xmlns:wps="http://schemas.microsoft.com/office/word/2010/wordprocessingShape" mc:Ignorable="w14 w15 w16se w16cid w16 w16cex w16sdtdh wp14">
+<w:numbering xmlns:wpc="http://schemas.microsoft.com/office/word/2010/wordprocessingCanvas" xmlns:cx="http://schemas.microsoft.com/office/drawing/2014/chartex" xmlns:cx1="http://schemas.microsoft.com/office/drawing/2015/9/8/chartex" xmlns:cx2="http://schemas.microsoft.com/office/drawing/2015/10/21/chartex" xmlns:cx3="http://schemas.microsoft.com/office/drawing/2016/5/9/chartex" xmlns:cx4="http://schemas.microsoft.com/office/drawing/2016/5/10/chartex" xmlns:cx5="http://schemas.microsoft.com/office/drawing/2016/5/11/chartex" xmlns:cx6="http://schemas.microsoft.com/office/drawing/2016/5/12/chartex" xmlns:cx7="http://schemas.microsoft.com/office/drawing/2016/5/13/chartex" xmlns:cx8="http://schemas.microsoft.com/office/drawing/2016/5/14/chartex" xmlns:mc="http://schemas.openxmlformats.org/markup-compatibility/2006" xmlns:aink="http://schemas.microsoft.com/office/drawing/2016/ink" xmlns:am3d="http://schemas.microsoft.com/office/drawing/2017/model3d" xmlns:o="urn:schemas-microsoft-com:office:office" xmlns:oel="http://schemas.microsoft.com/office/2019/extlst" xmlns:r="http://schemas.openxmlformats.org/officeDocument/2006/relationships" xmlns:m="http://schemas.openxmlformats.org/officeDocument/2006/math" xmlns:v="urn:schemas-microsoft-com:vml" xmlns:wp14="http://schemas.microsoft.com/office/word/2010/wordprocessingDrawing" xmlns:wp="http://schemas.openxmlformats.org/drawingml/2006/wordprocessingDrawing" xmlns:w10="urn:schemas-microsoft-com:office:word" xmlns:w="http://schemas.openxmlformats.org/wordprocessingml/2006/main" xmlns:w14="http://schemas.microsoft.com/office/word/2010/wordml" xmlns:w15="http://schemas.microsoft.com/office/word/2012/wordml" xmlns:w16cex="http://schemas.microsoft.com/office/word/2018/wordml/cex" xmlns:w16cid="http://schemas.microsoft.com/office/word/2016/wordml/cid" xmlns:w16="http://schemas.microsoft.com/office/word/2018/wordml" xmlns:w16du="http://schemas.microsoft.com/office/word/2023/wordml/word16du" xmlns:w16sdtdh="http://schemas.microsoft.com/office/word/2020/wordml/sdtdatahash" xmlns:w16sdtfl="http://schemas.microsoft.com/office/word/2024/wordml/sdtformatlock" xmlns:w16se="http://schemas.microsoft.com/office/word/2015/wordml/symex" xmlns:wpg="http://schemas.microsoft.com/office/word/2010/wordprocessingGroup" xmlns:wpi="http://schemas.microsoft.com/office/word/2010/wordprocessingInk" xmlns:wne="http://schemas.microsoft.com/office/word/2006/wordml" xmlns:wps="http://schemas.microsoft.com/office/word/2010/wordprocessingShape" mc:Ignorable="w14 w15 w16se w16cid w16 w16cex w16sdtdh w16sdtfl w16du wp14">
   <w:abstractNum w:abstractNumId="0" w15:restartNumberingAfterBreak="0">
     <w:nsid w:val="0E627AF0"/>
     <w:multiLevelType w:val="multilevel"/>
@@ -3505,7 +3389,7 @@
 </file>
 
 <file path=word/styles.xml><?xml version="1.0" encoding="utf-8"?>
-<w:styles xmlns:mc="http://schemas.openxmlformats.org/markup-compatibility/2006" xmlns:r="http://schemas.openxmlformats.org/officeDocument/2006/relationships" xmlns:w="http://schemas.openxmlformats.org/wordprocessingml/2006/main" xmlns:w14="http://schemas.microsoft.com/office/word/2010/wordml" xmlns:w15="http://schemas.microsoft.com/office/word/2012/wordml" xmlns:w16cex="http://schemas.microsoft.com/office/word/2018/wordml/cex" xmlns:w16cid="http://schemas.microsoft.com/office/word/2016/wordml/cid" xmlns:w16="http://schemas.microsoft.com/office/word/2018/wordml" xmlns:w16sdtdh="http://schemas.microsoft.com/office/word/2020/wordml/sdtdatahash" xmlns:w16se="http://schemas.microsoft.com/office/word/2015/wordml/symex" mc:Ignorable="w14 w15 w16se w16cid w16 w16cex w16sdtdh">
+<w:styles xmlns:mc="http://schemas.openxmlformats.org/markup-compatibility/2006" xmlns:r="http://schemas.openxmlformats.org/officeDocument/2006/relationships" xmlns:w="http://schemas.openxmlformats.org/wordprocessingml/2006/main" xmlns:w14="http://schemas.microsoft.com/office/word/2010/wordml" xmlns:w15="http://schemas.microsoft.com/office/word/2012/wordml" xmlns:w16cex="http://schemas.microsoft.com/office/word/2018/wordml/cex" xmlns:w16cid="http://schemas.microsoft.com/office/word/2016/wordml/cid" xmlns:w16="http://schemas.microsoft.com/office/word/2018/wordml" xmlns:w16du="http://schemas.microsoft.com/office/word/2023/wordml/word16du" xmlns:w16sdtdh="http://schemas.microsoft.com/office/word/2020/wordml/sdtdatahash" xmlns:w16sdtfl="http://schemas.microsoft.com/office/word/2024/wordml/sdtformatlock" xmlns:w16se="http://schemas.microsoft.com/office/word/2015/wordml/symex" mc:Ignorable="w14 w15 w16se w16cid w16 w16cex w16sdtdh w16sdtfl w16du">
   <w:docDefaults>
     <w:rPrDefault>
       <w:rPr>

</xml_diff>

<commit_message>
:books: docs - Documentação revisada
</commit_message>
<xml_diff>
--- a/Documentation/WORD/Sprint18_Task216_Aba_visualização detalhada_dados_backend.docx
+++ b/Documentation/WORD/Sprint18_Task216_Aba_visualização detalhada_dados_backend.docx
@@ -752,10 +752,12 @@
               <w:t xml:space="preserve">Fazer modal, aba ou nova </w:t>
             </w:r>
             <w:proofErr w:type="spellStart"/>
+            <w:proofErr w:type="gramStart"/>
             <w:r>
               <w:t>pagina</w:t>
             </w:r>
             <w:proofErr w:type="spellEnd"/>
+            <w:proofErr w:type="gramEnd"/>
             <w:r>
               <w:t xml:space="preserve"> para visualização detalhada de dados do </w:t>
             </w:r>
@@ -765,8 +767,13 @@
             </w:r>
             <w:proofErr w:type="spellEnd"/>
             <w:r>
-              <w:t xml:space="preserve"> por filtros diverso</w:t>
-            </w:r>
+              <w:t xml:space="preserve"> </w:t>
+            </w:r>
+            <w:proofErr w:type="gramStart"/>
+            <w:r>
+              <w:t>por filtros diverso</w:t>
+            </w:r>
+            <w:proofErr w:type="gramEnd"/>
           </w:p>
           <w:p>
             <w:pPr>
@@ -1119,6 +1126,7 @@
               <w:t xml:space="preserve">Fazer Aba (modal ou nova </w:t>
             </w:r>
             <w:proofErr w:type="spellStart"/>
+            <w:proofErr w:type="gramStart"/>
             <w:r>
               <w:rPr>
                 <w:rStyle w:val="Tipodeletrapredefinidodopargrafo"/>
@@ -1127,6 +1135,7 @@
               <w:t>pagina</w:t>
             </w:r>
             <w:proofErr w:type="spellEnd"/>
+            <w:proofErr w:type="gramEnd"/>
             <w:r>
               <w:rPr>
                 <w:rStyle w:val="Tipodeletrapredefinidodopargrafo"/>
@@ -1148,8 +1157,17 @@
                 <w:rStyle w:val="Tipodeletrapredefinidodopargrafo"/>
                 <w:rFonts w:cs="Aptos"/>
               </w:rPr>
-              <w:t xml:space="preserve"> por filtros diverso</w:t>
-            </w:r>
+              <w:t xml:space="preserve"> </w:t>
+            </w:r>
+            <w:proofErr w:type="gramStart"/>
+            <w:r>
+              <w:rPr>
+                <w:rStyle w:val="Tipodeletrapredefinidodopargrafo"/>
+                <w:rFonts w:cs="Aptos"/>
+              </w:rPr>
+              <w:t>por filtros diverso</w:t>
+            </w:r>
+            <w:proofErr w:type="gramEnd"/>
           </w:p>
         </w:tc>
         <w:tc>
@@ -1595,6 +1613,7 @@
         <w:t xml:space="preserve">, </w:t>
       </w:r>
       <w:proofErr w:type="spellStart"/>
+      <w:proofErr w:type="gramStart"/>
       <w:r>
         <w:t>actions</w:t>
       </w:r>
@@ -1607,6 +1626,7 @@
         <w:t>etc</w:t>
       </w:r>
       <w:proofErr w:type="spellEnd"/>
+      <w:proofErr w:type="gramEnd"/>
       <w:r>
         <w:t>).</w:t>
       </w:r>
@@ -1651,7 +1671,15 @@
     </w:p>
     <w:p>
       <w:r>
-        <w:t>Caso exista paginação server-</w:t>
+        <w:t xml:space="preserve">Caso exista paginação </w:t>
+      </w:r>
+      <w:proofErr w:type="gramStart"/>
+      <w:r>
+        <w:t>server</w:t>
+      </w:r>
+      <w:proofErr w:type="gramEnd"/>
+      <w:r>
+        <w:t>-</w:t>
       </w:r>
       <w:proofErr w:type="spellStart"/>
       <w:r>
@@ -1769,7 +1797,23 @@
           <w:rStyle w:val="Tipodeletrapredefinidodopargrafo"/>
           <w:rFonts w:cs="Aptos"/>
         </w:rPr>
-        <w:t>A sprint também priorizou responsividade e experiência do usuário, garantindo funcionamento adequado em desktop, tablet e mobile, além de scroll horizontal controlado em tabelas extensas e feedback visual durante carregamentos e exportações. A solução foi preparada para suportar paginação server-</w:t>
+        <w:t xml:space="preserve">A sprint também priorizou responsividade e experiência do usuário, garantindo funcionamento adequado em desktop, tablet e mobile, além de scroll horizontal controlado em tabelas extensas e feedback visual durante carregamentos e exportações. A solução foi preparada para suportar paginação </w:t>
+      </w:r>
+      <w:proofErr w:type="gramStart"/>
+      <w:r>
+        <w:rPr>
+          <w:rStyle w:val="Tipodeletrapredefinidodopargrafo"/>
+          <w:rFonts w:cs="Aptos"/>
+        </w:rPr>
+        <w:t>server</w:t>
+      </w:r>
+      <w:proofErr w:type="gramEnd"/>
+      <w:r>
+        <w:rPr>
+          <w:rStyle w:val="Tipodeletrapredefinidodopargrafo"/>
+          <w:rFonts w:cs="Aptos"/>
+        </w:rPr>
+        <w:t>-</w:t>
       </w:r>
       <w:proofErr w:type="spellStart"/>
       <w:r>
@@ -1815,8 +1859,342 @@
           <w:rStyle w:val="Tipodeletrapredefinidodopargrafo"/>
           <w:rFonts w:cs="Aptos"/>
         </w:rPr>
+        <w:lastRenderedPageBreak/>
         <w:br/>
       </w:r>
+      <w:r>
+        <w:drawing>
+          <wp:inline distT="0" distB="0" distL="0" distR="0" wp14:anchorId="2B0258A1" wp14:editId="0378322C">
+            <wp:extent cx="6472555" cy="4944110"/>
+            <wp:effectExtent l="0" t="0" r="4445" b="8890"/>
+            <wp:docPr id="1793837172" name="Imagem 2"/>
+            <wp:cNvGraphicFramePr>
+              <a:graphicFrameLocks xmlns:a="http://schemas.openxmlformats.org/drawingml/2006/main" noChangeAspect="1"/>
+            </wp:cNvGraphicFramePr>
+            <a:graphic xmlns:a="http://schemas.openxmlformats.org/drawingml/2006/main">
+              <a:graphicData uri="http://schemas.openxmlformats.org/drawingml/2006/picture">
+                <pic:pic xmlns:pic="http://schemas.openxmlformats.org/drawingml/2006/picture">
+                  <pic:nvPicPr>
+                    <pic:cNvPr id="0" name="Picture 6"/>
+                    <pic:cNvPicPr>
+                      <a:picLocks noChangeAspect="1" noChangeArrowheads="1"/>
+                    </pic:cNvPicPr>
+                  </pic:nvPicPr>
+                  <pic:blipFill>
+                    <a:blip r:embed="rId8">
+                      <a:extLst>
+                        <a:ext uri="{28A0092B-C50C-407E-A947-70E740481C1C}">
+                          <a14:useLocalDpi xmlns:a14="http://schemas.microsoft.com/office/drawing/2010/main" val="0"/>
+                        </a:ext>
+                      </a:extLst>
+                    </a:blip>
+                    <a:srcRect/>
+                    <a:stretch>
+                      <a:fillRect/>
+                    </a:stretch>
+                  </pic:blipFill>
+                  <pic:spPr bwMode="auto">
+                    <a:xfrm>
+                      <a:off x="0" y="0"/>
+                      <a:ext cx="6472555" cy="4944110"/>
+                    </a:xfrm>
+                    <a:prstGeom prst="rect">
+                      <a:avLst/>
+                    </a:prstGeom>
+                    <a:noFill/>
+                    <a:ln>
+                      <a:noFill/>
+                    </a:ln>
+                  </pic:spPr>
+                </pic:pic>
+              </a:graphicData>
+            </a:graphic>
+          </wp:inline>
+        </w:drawing>
+      </w:r>
+    </w:p>
+    <w:p>
+      <w:pPr>
+        <w:spacing w:before="240" w:after="240"/>
+      </w:pPr>
+      <w:r>
+        <w:lastRenderedPageBreak/>
+        <w:drawing>
+          <wp:inline distT="0" distB="0" distL="0" distR="0" wp14:anchorId="28036962" wp14:editId="54DD50DC">
+            <wp:extent cx="6472555" cy="4944110"/>
+            <wp:effectExtent l="0" t="0" r="4445" b="8890"/>
+            <wp:docPr id="672318490" name="Imagem 4"/>
+            <wp:cNvGraphicFramePr>
+              <a:graphicFrameLocks xmlns:a="http://schemas.openxmlformats.org/drawingml/2006/main" noChangeAspect="1"/>
+            </wp:cNvGraphicFramePr>
+            <a:graphic xmlns:a="http://schemas.openxmlformats.org/drawingml/2006/main">
+              <a:graphicData uri="http://schemas.openxmlformats.org/drawingml/2006/picture">
+                <pic:pic xmlns:pic="http://schemas.openxmlformats.org/drawingml/2006/picture">
+                  <pic:nvPicPr>
+                    <pic:cNvPr id="0" name="Picture 13"/>
+                    <pic:cNvPicPr>
+                      <a:picLocks noChangeAspect="1" noChangeArrowheads="1"/>
+                    </pic:cNvPicPr>
+                  </pic:nvPicPr>
+                  <pic:blipFill>
+                    <a:blip r:embed="rId9">
+                      <a:extLst>
+                        <a:ext uri="{28A0092B-C50C-407E-A947-70E740481C1C}">
+                          <a14:useLocalDpi xmlns:a14="http://schemas.microsoft.com/office/drawing/2010/main" val="0"/>
+                        </a:ext>
+                      </a:extLst>
+                    </a:blip>
+                    <a:srcRect/>
+                    <a:stretch>
+                      <a:fillRect/>
+                    </a:stretch>
+                  </pic:blipFill>
+                  <pic:spPr bwMode="auto">
+                    <a:xfrm>
+                      <a:off x="0" y="0"/>
+                      <a:ext cx="6472555" cy="4944110"/>
+                    </a:xfrm>
+                    <a:prstGeom prst="rect">
+                      <a:avLst/>
+                    </a:prstGeom>
+                    <a:noFill/>
+                    <a:ln>
+                      <a:noFill/>
+                    </a:ln>
+                  </pic:spPr>
+                </pic:pic>
+              </a:graphicData>
+            </a:graphic>
+          </wp:inline>
+        </w:drawing>
+      </w:r>
+    </w:p>
+    <w:p>
+      <w:pPr>
+        <w:spacing w:before="240" w:after="240"/>
+      </w:pPr>
+      <w:r>
+        <w:drawing>
+          <wp:inline distT="0" distB="0" distL="0" distR="0" wp14:anchorId="2903DF58" wp14:editId="0AF615D1">
+            <wp:extent cx="6472555" cy="4494530"/>
+            <wp:effectExtent l="0" t="0" r="4445" b="1270"/>
+            <wp:docPr id="2073032777" name="Imagem 6"/>
+            <wp:cNvGraphicFramePr>
+              <a:graphicFrameLocks xmlns:a="http://schemas.openxmlformats.org/drawingml/2006/main" noChangeAspect="1"/>
+            </wp:cNvGraphicFramePr>
+            <a:graphic xmlns:a="http://schemas.openxmlformats.org/drawingml/2006/main">
+              <a:graphicData uri="http://schemas.openxmlformats.org/drawingml/2006/picture">
+                <pic:pic xmlns:pic="http://schemas.openxmlformats.org/drawingml/2006/picture">
+                  <pic:nvPicPr>
+                    <pic:cNvPr id="0" name="Picture 20"/>
+                    <pic:cNvPicPr>
+                      <a:picLocks noChangeAspect="1" noChangeArrowheads="1"/>
+                    </pic:cNvPicPr>
+                  </pic:nvPicPr>
+                  <pic:blipFill>
+                    <a:blip r:embed="rId10">
+                      <a:extLst>
+                        <a:ext uri="{28A0092B-C50C-407E-A947-70E740481C1C}">
+                          <a14:useLocalDpi xmlns:a14="http://schemas.microsoft.com/office/drawing/2010/main" val="0"/>
+                        </a:ext>
+                      </a:extLst>
+                    </a:blip>
+                    <a:srcRect/>
+                    <a:stretch>
+                      <a:fillRect/>
+                    </a:stretch>
+                  </pic:blipFill>
+                  <pic:spPr bwMode="auto">
+                    <a:xfrm>
+                      <a:off x="0" y="0"/>
+                      <a:ext cx="6472555" cy="4494530"/>
+                    </a:xfrm>
+                    <a:prstGeom prst="rect">
+                      <a:avLst/>
+                    </a:prstGeom>
+                    <a:noFill/>
+                    <a:ln>
+                      <a:noFill/>
+                    </a:ln>
+                  </pic:spPr>
+                </pic:pic>
+              </a:graphicData>
+            </a:graphic>
+          </wp:inline>
+        </w:drawing>
+      </w:r>
+    </w:p>
+    <w:p>
+      <w:pPr>
+        <w:spacing w:before="240" w:after="240"/>
+      </w:pPr>
+      <w:r>
+        <w:lastRenderedPageBreak/>
+        <w:drawing>
+          <wp:inline distT="0" distB="0" distL="0" distR="0" wp14:anchorId="4761274A" wp14:editId="50445331">
+            <wp:extent cx="6472555" cy="4494530"/>
+            <wp:effectExtent l="0" t="0" r="4445" b="1270"/>
+            <wp:docPr id="348173692" name="Imagem 8"/>
+            <wp:cNvGraphicFramePr>
+              <a:graphicFrameLocks xmlns:a="http://schemas.openxmlformats.org/drawingml/2006/main" noChangeAspect="1"/>
+            </wp:cNvGraphicFramePr>
+            <a:graphic xmlns:a="http://schemas.openxmlformats.org/drawingml/2006/main">
+              <a:graphicData uri="http://schemas.openxmlformats.org/drawingml/2006/picture">
+                <pic:pic xmlns:pic="http://schemas.openxmlformats.org/drawingml/2006/picture">
+                  <pic:nvPicPr>
+                    <pic:cNvPr id="0" name="Picture 27"/>
+                    <pic:cNvPicPr>
+                      <a:picLocks noChangeAspect="1" noChangeArrowheads="1"/>
+                    </pic:cNvPicPr>
+                  </pic:nvPicPr>
+                  <pic:blipFill>
+                    <a:blip r:embed="rId11">
+                      <a:extLst>
+                        <a:ext uri="{28A0092B-C50C-407E-A947-70E740481C1C}">
+                          <a14:useLocalDpi xmlns:a14="http://schemas.microsoft.com/office/drawing/2010/main" val="0"/>
+                        </a:ext>
+                      </a:extLst>
+                    </a:blip>
+                    <a:srcRect/>
+                    <a:stretch>
+                      <a:fillRect/>
+                    </a:stretch>
+                  </pic:blipFill>
+                  <pic:spPr bwMode="auto">
+                    <a:xfrm>
+                      <a:off x="0" y="0"/>
+                      <a:ext cx="6472555" cy="4494530"/>
+                    </a:xfrm>
+                    <a:prstGeom prst="rect">
+                      <a:avLst/>
+                    </a:prstGeom>
+                    <a:noFill/>
+                    <a:ln>
+                      <a:noFill/>
+                    </a:ln>
+                  </pic:spPr>
+                </pic:pic>
+              </a:graphicData>
+            </a:graphic>
+          </wp:inline>
+        </w:drawing>
+      </w:r>
+    </w:p>
+    <w:p>
+      <w:pPr>
+        <w:spacing w:before="240" w:after="240"/>
+      </w:pPr>
+      <w:r>
+        <w:drawing>
+          <wp:inline distT="0" distB="0" distL="0" distR="0" wp14:anchorId="6B402890" wp14:editId="341A32B7">
+            <wp:extent cx="6472555" cy="4494530"/>
+            <wp:effectExtent l="0" t="0" r="4445" b="1270"/>
+            <wp:docPr id="524736391" name="Imagem 10"/>
+            <wp:cNvGraphicFramePr>
+              <a:graphicFrameLocks xmlns:a="http://schemas.openxmlformats.org/drawingml/2006/main" noChangeAspect="1"/>
+            </wp:cNvGraphicFramePr>
+            <a:graphic xmlns:a="http://schemas.openxmlformats.org/drawingml/2006/main">
+              <a:graphicData uri="http://schemas.openxmlformats.org/drawingml/2006/picture">
+                <pic:pic xmlns:pic="http://schemas.openxmlformats.org/drawingml/2006/picture">
+                  <pic:nvPicPr>
+                    <pic:cNvPr id="0" name="Picture 34"/>
+                    <pic:cNvPicPr>
+                      <a:picLocks noChangeAspect="1" noChangeArrowheads="1"/>
+                    </pic:cNvPicPr>
+                  </pic:nvPicPr>
+                  <pic:blipFill>
+                    <a:blip r:embed="rId12">
+                      <a:extLst>
+                        <a:ext uri="{28A0092B-C50C-407E-A947-70E740481C1C}">
+                          <a14:useLocalDpi xmlns:a14="http://schemas.microsoft.com/office/drawing/2010/main" val="0"/>
+                        </a:ext>
+                      </a:extLst>
+                    </a:blip>
+                    <a:srcRect/>
+                    <a:stretch>
+                      <a:fillRect/>
+                    </a:stretch>
+                  </pic:blipFill>
+                  <pic:spPr bwMode="auto">
+                    <a:xfrm>
+                      <a:off x="0" y="0"/>
+                      <a:ext cx="6472555" cy="4494530"/>
+                    </a:xfrm>
+                    <a:prstGeom prst="rect">
+                      <a:avLst/>
+                    </a:prstGeom>
+                    <a:noFill/>
+                    <a:ln>
+                      <a:noFill/>
+                    </a:ln>
+                  </pic:spPr>
+                </pic:pic>
+              </a:graphicData>
+            </a:graphic>
+          </wp:inline>
+        </w:drawing>
+      </w:r>
+    </w:p>
+    <w:p>
+      <w:pPr>
+        <w:spacing w:before="240" w:after="240"/>
+      </w:pPr>
+      <w:r>
+        <w:lastRenderedPageBreak/>
+        <w:drawing>
+          <wp:inline distT="0" distB="0" distL="0" distR="0" wp14:anchorId="0C9022B1" wp14:editId="3F685308">
+            <wp:extent cx="6472555" cy="4494530"/>
+            <wp:effectExtent l="0" t="0" r="4445" b="1270"/>
+            <wp:docPr id="118045967" name="Imagem 12"/>
+            <wp:cNvGraphicFramePr>
+              <a:graphicFrameLocks xmlns:a="http://schemas.openxmlformats.org/drawingml/2006/main" noChangeAspect="1"/>
+            </wp:cNvGraphicFramePr>
+            <a:graphic xmlns:a="http://schemas.openxmlformats.org/drawingml/2006/main">
+              <a:graphicData uri="http://schemas.openxmlformats.org/drawingml/2006/picture">
+                <pic:pic xmlns:pic="http://schemas.openxmlformats.org/drawingml/2006/picture">
+                  <pic:nvPicPr>
+                    <pic:cNvPr id="0" name="Picture 41"/>
+                    <pic:cNvPicPr>
+                      <a:picLocks noChangeAspect="1" noChangeArrowheads="1"/>
+                    </pic:cNvPicPr>
+                  </pic:nvPicPr>
+                  <pic:blipFill>
+                    <a:blip r:embed="rId13">
+                      <a:extLst>
+                        <a:ext uri="{28A0092B-C50C-407E-A947-70E740481C1C}">
+                          <a14:useLocalDpi xmlns:a14="http://schemas.microsoft.com/office/drawing/2010/main" val="0"/>
+                        </a:ext>
+                      </a:extLst>
+                    </a:blip>
+                    <a:srcRect/>
+                    <a:stretch>
+                      <a:fillRect/>
+                    </a:stretch>
+                  </pic:blipFill>
+                  <pic:spPr bwMode="auto">
+                    <a:xfrm>
+                      <a:off x="0" y="0"/>
+                      <a:ext cx="6472555" cy="4494530"/>
+                    </a:xfrm>
+                    <a:prstGeom prst="rect">
+                      <a:avLst/>
+                    </a:prstGeom>
+                    <a:noFill/>
+                    <a:ln>
+                      <a:noFill/>
+                    </a:ln>
+                  </pic:spPr>
+                </pic:pic>
+              </a:graphicData>
+            </a:graphic>
+          </wp:inline>
+        </w:drawing>
+      </w:r>
+    </w:p>
+    <w:p>
+      <w:pPr>
+        <w:spacing w:before="240" w:after="240"/>
+      </w:pPr>
     </w:p>
     <w:p>
       <w:pPr>
@@ -4047,7 +4425,6 @@
   <w:style w:type="character" w:default="1" w:styleId="Fontepargpadro">
     <w:name w:val="Default Paragraph Font"/>
     <w:uiPriority w:val="1"/>
-    <w:semiHidden/>
     <w:unhideWhenUsed/>
   </w:style>
   <w:style w:type="table" w:default="1" w:styleId="Tabelanormal">

</xml_diff>